<commit_message>
doc update, english transtation, pictures
</commit_message>
<xml_diff>
--- a/doc/murmulator-ps2-modifiers-oscillograms.docx
+++ b/doc/murmulator-ps2-modifiers-oscillograms.docx
@@ -48,6 +48,7 @@
     <w:p>
       <w:pPr>
         <w:spacing w:after="120"/>
+        <w:jc w:val="left"/>
       </w:pPr>
       <w:r>
         <w:t xml:space="preserve">Все сигналы были захвачены на реальном устройстве Murmulator VGA 7x9 (YD-RP2040) в рамках диагностики проблемы с искажением символов при PS/2-вводе (Lode Runner). Цель — проверить целостность сигнала CLK/DATA для каждого модификатора отдельно от make- и break-кодов.</w:t>
@@ -56,6 +57,7 @@
     <w:p>
       <w:pPr>
         <w:spacing w:after="120"/>
+        <w:jc w:val="left"/>
       </w:pPr>
       <w:r>
         <w:rPr>
@@ -66,6 +68,9 @@
       </w:r>
     </w:p>
     <w:p>
+      <w:pPr>
+        <w:jc w:val="left"/>
+      </w:pPr>
       <w:r>
         <w:br w:type="page"/>
       </w:r>
@@ -74,6 +79,7 @@
       <w:pPr>
         <w:pStyle w:val="Heading2"/>
         <w:spacing w:after="150" w:before="300"/>
+        <w:jc w:val="left"/>
       </w:pPr>
       <w:r>
         <w:t xml:space="preserve">Left Ctrl</w:t>
@@ -82,6 +88,7 @@
     <w:p>
       <w:pPr>
         <w:spacing w:after="120"/>
+        <w:jc w:val="left"/>
       </w:pPr>
       <w:r>
         <w:rPr>
@@ -96,6 +103,7 @@
       <w:pPr>
         <w:pStyle w:val="Heading3"/>
         <w:spacing w:after="150" w:before="300"/>
+        <w:jc w:val="left"/>
       </w:pPr>
       <w:r>
         <w:t xml:space="preserve">Make-код (нажатие)</w:t>
@@ -167,6 +175,7 @@
       <w:pPr>
         <w:pStyle w:val="Heading3"/>
         <w:spacing w:after="150" w:before="300"/>
+        <w:jc w:val="left"/>
       </w:pPr>
       <w:r>
         <w:t xml:space="preserve">Break-код (отпускание)</w:t>
@@ -237,6 +246,7 @@
     <w:p>
       <w:pPr>
         <w:spacing w:after="120"/>
+        <w:jc w:val="left"/>
       </w:pPr>
       <w:r>
         <w:rPr>
@@ -254,6 +264,7 @@
           <w:numId w:val="1"/>
         </w:numPr>
         <w:spacing w:after="60"/>
+        <w:jc w:val="left"/>
       </w:pPr>
       <w:r>
         <w:t xml:space="preserve">Оба канала чистые, острые фронты, без звона и просадок</w:t>
@@ -267,12 +278,16 @@
           <w:numId w:val="1"/>
         </w:numPr>
         <w:spacing w:after="60"/>
+        <w:jc w:val="left"/>
       </w:pPr>
       <w:r>
         <w:t xml:space="preserve">Эталонный референс для сравнения с E0-префиксными клавишами</w:t>
       </w:r>
     </w:p>
     <w:p>
+      <w:pPr>
+        <w:jc w:val="left"/>
+      </w:pPr>
       <w:r>
         <w:br w:type="page"/>
       </w:r>
@@ -281,6 +296,7 @@
       <w:pPr>
         <w:pStyle w:val="Heading2"/>
         <w:spacing w:after="150" w:before="300"/>
+        <w:jc w:val="left"/>
       </w:pPr>
       <w:r>
         <w:t xml:space="preserve">Right Ctrl</w:t>
@@ -289,6 +305,7 @@
     <w:p>
       <w:pPr>
         <w:spacing w:after="120"/>
+        <w:jc w:val="left"/>
       </w:pPr>
       <w:r>
         <w:rPr>
@@ -303,6 +320,7 @@
       <w:pPr>
         <w:pStyle w:val="Heading3"/>
         <w:spacing w:after="150" w:before="300"/>
+        <w:jc w:val="left"/>
       </w:pPr>
       <w:r>
         <w:t xml:space="preserve">Make-код (нажатие)</w:t>
@@ -374,6 +392,7 @@
       <w:pPr>
         <w:pStyle w:val="Heading3"/>
         <w:spacing w:after="150" w:before="300"/>
+        <w:jc w:val="left"/>
       </w:pPr>
       <w:r>
         <w:t xml:space="preserve">Break-код (отпускание)</w:t>
@@ -444,6 +463,7 @@
     <w:p>
       <w:pPr>
         <w:spacing w:after="120"/>
+        <w:jc w:val="left"/>
       </w:pPr>
       <w:r>
         <w:rPr>
@@ -461,6 +481,7 @@
           <w:numId w:val="1"/>
         </w:numPr>
         <w:spacing w:after="60"/>
+        <w:jc w:val="left"/>
       </w:pPr>
       <w:r>
         <w:t xml:space="preserve">Полный 3-байтовый E0-цикл передаётся чисто</w:t>
@@ -474,12 +495,16 @@
           <w:numId w:val="1"/>
         </w:numPr>
         <w:spacing w:after="60"/>
+        <w:jc w:val="left"/>
       </w:pPr>
       <w:r>
         <w:t xml:space="preserve">Подтверждает, что передача многобайтовых E0-последовательностей физически исправна для этой клавиши</w:t>
       </w:r>
     </w:p>
     <w:p>
+      <w:pPr>
+        <w:jc w:val="left"/>
+      </w:pPr>
       <w:r>
         <w:br w:type="page"/>
       </w:r>
@@ -488,6 +513,7 @@
       <w:pPr>
         <w:pStyle w:val="Heading2"/>
         <w:spacing w:after="150" w:before="300"/>
+        <w:jc w:val="left"/>
       </w:pPr>
       <w:r>
         <w:t xml:space="preserve">Left Alt</w:t>
@@ -496,6 +522,7 @@
     <w:p>
       <w:pPr>
         <w:spacing w:after="120"/>
+        <w:jc w:val="left"/>
       </w:pPr>
       <w:r>
         <w:rPr>
@@ -510,6 +537,7 @@
       <w:pPr>
         <w:pStyle w:val="Heading3"/>
         <w:spacing w:after="150" w:before="300"/>
+        <w:jc w:val="left"/>
       </w:pPr>
       <w:r>
         <w:t xml:space="preserve">Make-код (нажатие)</w:t>
@@ -581,6 +609,7 @@
       <w:pPr>
         <w:pStyle w:val="Heading3"/>
         <w:spacing w:after="150" w:before="300"/>
+        <w:jc w:val="left"/>
       </w:pPr>
       <w:r>
         <w:t xml:space="preserve">Break-код (отпускание)</w:t>
@@ -651,6 +680,7 @@
     <w:p>
       <w:pPr>
         <w:spacing w:after="120"/>
+        <w:jc w:val="left"/>
       </w:pPr>
       <w:r>
         <w:rPr>
@@ -668,12 +698,16 @@
           <w:numId w:val="1"/>
         </w:numPr>
         <w:spacing w:after="60"/>
+        <w:jc w:val="left"/>
       </w:pPr>
       <w:r>
         <w:t xml:space="preserve">Сигнал чистый, без искажений</w:t>
       </w:r>
     </w:p>
     <w:p>
+      <w:pPr>
+        <w:jc w:val="left"/>
+      </w:pPr>
       <w:r>
         <w:br w:type="page"/>
       </w:r>
@@ -682,6 +716,7 @@
       <w:pPr>
         <w:pStyle w:val="Heading2"/>
         <w:spacing w:after="150" w:before="300"/>
+        <w:jc w:val="left"/>
       </w:pPr>
       <w:r>
         <w:t xml:space="preserve">Right Alt</w:t>
@@ -690,6 +725,7 @@
     <w:p>
       <w:pPr>
         <w:spacing w:after="120"/>
+        <w:jc w:val="left"/>
       </w:pPr>
       <w:r>
         <w:rPr>
@@ -704,6 +740,7 @@
       <w:pPr>
         <w:pStyle w:val="Heading3"/>
         <w:spacing w:after="150" w:before="300"/>
+        <w:jc w:val="left"/>
       </w:pPr>
       <w:r>
         <w:t xml:space="preserve">Make-код (нажатие)</w:t>
@@ -775,6 +812,7 @@
       <w:pPr>
         <w:pStyle w:val="Heading3"/>
         <w:spacing w:after="150" w:before="300"/>
+        <w:jc w:val="left"/>
       </w:pPr>
       <w:r>
         <w:t xml:space="preserve">Break-код (отпускание)</w:t>
@@ -845,6 +883,7 @@
     <w:p>
       <w:pPr>
         <w:spacing w:after="120"/>
+        <w:jc w:val="left"/>
       </w:pPr>
       <w:r>
         <w:rPr>
@@ -862,6 +901,7 @@
           <w:numId w:val="1"/>
         </w:numPr>
         <w:spacing w:after="60"/>
+        <w:jc w:val="left"/>
       </w:pPr>
       <w:r>
         <w:t xml:space="preserve">Полный 3-байтовый E0-цикл передаётся без ошибок</w:t>
@@ -875,12 +915,16 @@
           <w:numId w:val="1"/>
         </w:numPr>
         <w:spacing w:after="60"/>
+        <w:jc w:val="left"/>
       </w:pPr>
       <w:r>
         <w:t xml:space="preserve">Подтверждает, что Backspace/Delete-поведение — результат обработки прошивкой корректно принятого кода, а не следствие повреждённого сигнала</w:t>
       </w:r>
     </w:p>
     <w:p>
+      <w:pPr>
+        <w:jc w:val="left"/>
+      </w:pPr>
       <w:r>
         <w:br w:type="page"/>
       </w:r>
@@ -889,6 +933,7 @@
       <w:pPr>
         <w:pStyle w:val="Heading2"/>
         <w:spacing w:after="150" w:before="300"/>
+        <w:jc w:val="left"/>
       </w:pPr>
       <w:r>
         <w:t xml:space="preserve">Left Shift</w:t>
@@ -897,6 +942,7 @@
     <w:p>
       <w:pPr>
         <w:spacing w:after="120"/>
+        <w:jc w:val="left"/>
       </w:pPr>
       <w:r>
         <w:rPr>
@@ -911,6 +957,7 @@
       <w:pPr>
         <w:pStyle w:val="Heading3"/>
         <w:spacing w:after="150" w:before="300"/>
+        <w:jc w:val="left"/>
       </w:pPr>
       <w:r>
         <w:t xml:space="preserve">Make-код (нажатие)</w:t>
@@ -982,6 +1029,7 @@
       <w:pPr>
         <w:pStyle w:val="Heading3"/>
         <w:spacing w:after="150" w:before="300"/>
+        <w:jc w:val="left"/>
       </w:pPr>
       <w:r>
         <w:t xml:space="preserve">Break-код (отпускание)</w:t>
@@ -1052,6 +1100,7 @@
     <w:p>
       <w:pPr>
         <w:spacing w:after="120"/>
+        <w:jc w:val="left"/>
       </w:pPr>
       <w:r>
         <w:rPr>
@@ -1069,12 +1118,16 @@
           <w:numId w:val="1"/>
         </w:numPr>
         <w:spacing w:after="60"/>
+        <w:jc w:val="left"/>
       </w:pPr>
       <w:r>
         <w:t xml:space="preserve">Сигнал чистый, без искажений</w:t>
       </w:r>
     </w:p>
     <w:p>
+      <w:pPr>
+        <w:jc w:val="left"/>
+      </w:pPr>
       <w:r>
         <w:br w:type="page"/>
       </w:r>
@@ -1083,6 +1136,7 @@
       <w:pPr>
         <w:pStyle w:val="Heading2"/>
         <w:spacing w:after="150" w:before="300"/>
+        <w:jc w:val="left"/>
       </w:pPr>
       <w:r>
         <w:t xml:space="preserve">Right Shift</w:t>
@@ -1091,6 +1145,7 @@
     <w:p>
       <w:pPr>
         <w:spacing w:after="120"/>
+        <w:jc w:val="left"/>
       </w:pPr>
       <w:r>
         <w:rPr>
@@ -1105,6 +1160,7 @@
       <w:pPr>
         <w:pStyle w:val="Heading3"/>
         <w:spacing w:after="150" w:before="300"/>
+        <w:jc w:val="left"/>
       </w:pPr>
       <w:r>
         <w:t xml:space="preserve">Make-код (нажатие)</w:t>
@@ -1176,6 +1232,7 @@
       <w:pPr>
         <w:pStyle w:val="Heading3"/>
         <w:spacing w:after="150" w:before="300"/>
+        <w:jc w:val="left"/>
       </w:pPr>
       <w:r>
         <w:t xml:space="preserve">Break-код (отпускание)</w:t>
@@ -1246,6 +1303,7 @@
     <w:p>
       <w:pPr>
         <w:spacing w:after="120"/>
+        <w:jc w:val="left"/>
       </w:pPr>
       <w:r>
         <w:rPr>
@@ -1263,6 +1321,7 @@
           <w:numId w:val="1"/>
         </w:numPr>
         <w:spacing w:after="60"/>
+        <w:jc w:val="left"/>
       </w:pPr>
       <w:r>
         <w:t xml:space="preserve">Важное уточнение: Right Shift не является E0-кодом, в отличие от Right Ctrl и Right Alt</w:t>
@@ -1276,6 +1335,7 @@
           <w:numId w:val="1"/>
         </w:numPr>
         <w:spacing w:after="60"/>
+        <w:jc w:val="left"/>
       </w:pPr>
       <w:r>
         <w:t xml:space="preserve">Поскольку среди "проблемных" клавиш есть и E0-код (Right Alt), и не-E0-код (Right Shift), закономерность Backspace/Delete не связана с наличием E0-префикса как такового</w:t>
@@ -1289,12 +1349,16 @@
           <w:numId w:val="1"/>
         </w:numPr>
         <w:spacing w:after="60"/>
+        <w:jc w:val="left"/>
       </w:pPr>
       <w:r>
         <w:t xml:space="preserve">Указывает на маппинг по конкретным скан-кодам (0x59 и E0 11) в прошивке Tecnocat, а не на класс E0-последовательностей в целом</w:t>
       </w:r>
     </w:p>
     <w:p>
+      <w:pPr>
+        <w:jc w:val="left"/>
+      </w:pPr>
       <w:r>
         <w:br w:type="page"/>
       </w:r>
@@ -1303,6 +1367,7 @@
       <w:pPr>
         <w:pStyle w:val="Heading2"/>
         <w:spacing w:after="150" w:before="300"/>
+        <w:jc w:val="left"/>
       </w:pPr>
       <w:r>
         <w:t xml:space="preserve">Сводная таблица</w:t>
@@ -1310,6 +1375,7 @@
     </w:p>
     <w:tbl>
       <w:tblPr>
+        <w:bidiVisual w:val="0"/>
         <w:tblW w:type="dxa" w:w="9500"/>
         <w:tblBorders>
           <w:top w:val="single" w:color="auto" w:sz="4"/>
@@ -1337,6 +1403,9 @@
             <w:shd w:fill="2F5496" w:val="clear"/>
           </w:tcPr>
           <w:p>
+            <w:pPr>
+              <w:jc w:val="left"/>
+            </w:pPr>
             <w:r>
               <w:rPr>
                 <w:b/>
@@ -1355,6 +1424,9 @@
             <w:shd w:fill="2F5496" w:val="clear"/>
           </w:tcPr>
           <w:p>
+            <w:pPr>
+              <w:jc w:val="left"/>
+            </w:pPr>
             <w:r>
               <w:rPr>
                 <w:b/>
@@ -1373,6 +1445,9 @@
             <w:shd w:fill="2F5496" w:val="clear"/>
           </w:tcPr>
           <w:p>
+            <w:pPr>
+              <w:jc w:val="left"/>
+            </w:pPr>
             <w:r>
               <w:rPr>
                 <w:b/>
@@ -1391,6 +1466,9 @@
             <w:shd w:fill="2F5496" w:val="clear"/>
           </w:tcPr>
           <w:p>
+            <w:pPr>
+              <w:jc w:val="left"/>
+            </w:pPr>
             <w:r>
               <w:rPr>
                 <w:b/>
@@ -1409,6 +1487,9 @@
             <w:shd w:fill="2F5496" w:val="clear"/>
           </w:tcPr>
           <w:p>
+            <w:pPr>
+              <w:jc w:val="left"/>
+            </w:pPr>
             <w:r>
               <w:rPr>
                 <w:b/>
@@ -1428,6 +1509,9 @@
             <w:tcW w:type="dxa" w:w="1900"/>
           </w:tcPr>
           <w:p>
+            <w:pPr>
+              <w:jc w:val="left"/>
+            </w:pPr>
             <w:r>
               <w:rPr>
                 <w:sz w:val="20"/>
@@ -1442,6 +1526,9 @@
             <w:tcW w:type="dxa" w:w="1900"/>
           </w:tcPr>
           <w:p>
+            <w:pPr>
+              <w:jc w:val="left"/>
+            </w:pPr>
             <w:r>
               <w:rPr>
                 <w:sz w:val="20"/>
@@ -1456,6 +1543,9 @@
             <w:tcW w:type="dxa" w:w="1900"/>
           </w:tcPr>
           <w:p>
+            <w:pPr>
+              <w:jc w:val="left"/>
+            </w:pPr>
             <w:r>
               <w:rPr>
                 <w:sz w:val="20"/>
@@ -1470,6 +1560,9 @@
             <w:tcW w:type="dxa" w:w="1900"/>
           </w:tcPr>
           <w:p>
+            <w:pPr>
+              <w:jc w:val="left"/>
+            </w:pPr>
             <w:r>
               <w:rPr>
                 <w:sz w:val="20"/>
@@ -1484,6 +1577,9 @@
             <w:tcW w:type="dxa" w:w="1900"/>
           </w:tcPr>
           <w:p>
+            <w:pPr>
+              <w:jc w:val="left"/>
+            </w:pPr>
             <w:r>
               <w:rPr>
                 <w:sz w:val="20"/>
@@ -1500,6 +1596,9 @@
             <w:tcW w:type="dxa" w:w="1900"/>
           </w:tcPr>
           <w:p>
+            <w:pPr>
+              <w:jc w:val="left"/>
+            </w:pPr>
             <w:r>
               <w:rPr>
                 <w:sz w:val="20"/>
@@ -1514,6 +1613,9 @@
             <w:tcW w:type="dxa" w:w="1900"/>
           </w:tcPr>
           <w:p>
+            <w:pPr>
+              <w:jc w:val="left"/>
+            </w:pPr>
             <w:r>
               <w:rPr>
                 <w:sz w:val="20"/>
@@ -1528,6 +1630,9 @@
             <w:tcW w:type="dxa" w:w="1900"/>
           </w:tcPr>
           <w:p>
+            <w:pPr>
+              <w:jc w:val="left"/>
+            </w:pPr>
             <w:r>
               <w:rPr>
                 <w:sz w:val="20"/>
@@ -1542,6 +1647,9 @@
             <w:tcW w:type="dxa" w:w="1900"/>
           </w:tcPr>
           <w:p>
+            <w:pPr>
+              <w:jc w:val="left"/>
+            </w:pPr>
             <w:r>
               <w:rPr>
                 <w:sz w:val="20"/>
@@ -1556,6 +1664,9 @@
             <w:tcW w:type="dxa" w:w="1900"/>
           </w:tcPr>
           <w:p>
+            <w:pPr>
+              <w:jc w:val="left"/>
+            </w:pPr>
             <w:r>
               <w:rPr>
                 <w:sz w:val="20"/>
@@ -1572,6 +1683,9 @@
             <w:tcW w:type="dxa" w:w="1900"/>
           </w:tcPr>
           <w:p>
+            <w:pPr>
+              <w:jc w:val="left"/>
+            </w:pPr>
             <w:r>
               <w:rPr>
                 <w:sz w:val="20"/>
@@ -1586,6 +1700,9 @@
             <w:tcW w:type="dxa" w:w="1900"/>
           </w:tcPr>
           <w:p>
+            <w:pPr>
+              <w:jc w:val="left"/>
+            </w:pPr>
             <w:r>
               <w:rPr>
                 <w:sz w:val="20"/>
@@ -1600,6 +1717,9 @@
             <w:tcW w:type="dxa" w:w="1900"/>
           </w:tcPr>
           <w:p>
+            <w:pPr>
+              <w:jc w:val="left"/>
+            </w:pPr>
             <w:r>
               <w:rPr>
                 <w:sz w:val="20"/>
@@ -1614,6 +1734,9 @@
             <w:tcW w:type="dxa" w:w="1900"/>
           </w:tcPr>
           <w:p>
+            <w:pPr>
+              <w:jc w:val="left"/>
+            </w:pPr>
             <w:r>
               <w:rPr>
                 <w:sz w:val="20"/>
@@ -1628,6 +1751,9 @@
             <w:tcW w:type="dxa" w:w="1900"/>
           </w:tcPr>
           <w:p>
+            <w:pPr>
+              <w:jc w:val="left"/>
+            </w:pPr>
             <w:r>
               <w:rPr>
                 <w:sz w:val="20"/>
@@ -1644,6 +1770,9 @@
             <w:tcW w:type="dxa" w:w="1900"/>
           </w:tcPr>
           <w:p>
+            <w:pPr>
+              <w:jc w:val="left"/>
+            </w:pPr>
             <w:r>
               <w:rPr>
                 <w:sz w:val="20"/>
@@ -1658,6 +1787,9 @@
             <w:tcW w:type="dxa" w:w="1900"/>
           </w:tcPr>
           <w:p>
+            <w:pPr>
+              <w:jc w:val="left"/>
+            </w:pPr>
             <w:r>
               <w:rPr>
                 <w:sz w:val="20"/>
@@ -1672,6 +1804,9 @@
             <w:tcW w:type="dxa" w:w="1900"/>
           </w:tcPr>
           <w:p>
+            <w:pPr>
+              <w:jc w:val="left"/>
+            </w:pPr>
             <w:r>
               <w:rPr>
                 <w:sz w:val="20"/>
@@ -1686,6 +1821,9 @@
             <w:tcW w:type="dxa" w:w="1900"/>
           </w:tcPr>
           <w:p>
+            <w:pPr>
+              <w:jc w:val="left"/>
+            </w:pPr>
             <w:r>
               <w:rPr>
                 <w:sz w:val="20"/>
@@ -1700,6 +1838,9 @@
             <w:tcW w:type="dxa" w:w="1900"/>
           </w:tcPr>
           <w:p>
+            <w:pPr>
+              <w:jc w:val="left"/>
+            </w:pPr>
             <w:r>
               <w:rPr>
                 <w:sz w:val="20"/>
@@ -1716,6 +1857,9 @@
             <w:tcW w:type="dxa" w:w="1900"/>
           </w:tcPr>
           <w:p>
+            <w:pPr>
+              <w:jc w:val="left"/>
+            </w:pPr>
             <w:r>
               <w:rPr>
                 <w:sz w:val="20"/>
@@ -1730,6 +1874,9 @@
             <w:tcW w:type="dxa" w:w="1900"/>
           </w:tcPr>
           <w:p>
+            <w:pPr>
+              <w:jc w:val="left"/>
+            </w:pPr>
             <w:r>
               <w:rPr>
                 <w:sz w:val="20"/>
@@ -1744,6 +1891,9 @@
             <w:tcW w:type="dxa" w:w="1900"/>
           </w:tcPr>
           <w:p>
+            <w:pPr>
+              <w:jc w:val="left"/>
+            </w:pPr>
             <w:r>
               <w:rPr>
                 <w:sz w:val="20"/>
@@ -1758,6 +1908,9 @@
             <w:tcW w:type="dxa" w:w="1900"/>
           </w:tcPr>
           <w:p>
+            <w:pPr>
+              <w:jc w:val="left"/>
+            </w:pPr>
             <w:r>
               <w:rPr>
                 <w:sz w:val="20"/>
@@ -1772,6 +1925,9 @@
             <w:tcW w:type="dxa" w:w="1900"/>
           </w:tcPr>
           <w:p>
+            <w:pPr>
+              <w:jc w:val="left"/>
+            </w:pPr>
             <w:r>
               <w:rPr>
                 <w:sz w:val="20"/>
@@ -1788,6 +1944,9 @@
             <w:tcW w:type="dxa" w:w="1900"/>
           </w:tcPr>
           <w:p>
+            <w:pPr>
+              <w:jc w:val="left"/>
+            </w:pPr>
             <w:r>
               <w:rPr>
                 <w:sz w:val="20"/>
@@ -1802,6 +1961,9 @@
             <w:tcW w:type="dxa" w:w="1900"/>
           </w:tcPr>
           <w:p>
+            <w:pPr>
+              <w:jc w:val="left"/>
+            </w:pPr>
             <w:r>
               <w:rPr>
                 <w:sz w:val="20"/>
@@ -1816,6 +1978,9 @@
             <w:tcW w:type="dxa" w:w="1900"/>
           </w:tcPr>
           <w:p>
+            <w:pPr>
+              <w:jc w:val="left"/>
+            </w:pPr>
             <w:r>
               <w:rPr>
                 <w:sz w:val="20"/>
@@ -1830,6 +1995,9 @@
             <w:tcW w:type="dxa" w:w="1900"/>
           </w:tcPr>
           <w:p>
+            <w:pPr>
+              <w:jc w:val="left"/>
+            </w:pPr>
             <w:r>
               <w:rPr>
                 <w:sz w:val="20"/>
@@ -1844,6 +2012,9 @@
             <w:tcW w:type="dxa" w:w="1900"/>
           </w:tcPr>
           <w:p>
+            <w:pPr>
+              <w:jc w:val="left"/>
+            </w:pPr>
             <w:r>
               <w:rPr>
                 <w:sz w:val="20"/>
@@ -1858,11 +2029,13 @@
     <w:p>
       <w:pPr>
         <w:spacing w:before="300"/>
+        <w:jc w:val="left"/>
       </w:pPr>
     </w:p>
     <w:p>
       <w:pPr>
         <w:spacing w:after="120"/>
+        <w:jc w:val="left"/>
       </w:pPr>
       <w:r>
         <w:rPr>
@@ -2061,9 +2234,29 @@
 <file path=word/styles.xml><?xml version="1.0" encoding="utf-8"?>
 <w:styles xmlns:mc="http://schemas.openxmlformats.org/markup-compatibility/2006" xmlns:r="http://schemas.openxmlformats.org/officeDocument/2006/relationships" xmlns:w="http://schemas.openxmlformats.org/wordprocessingml/2006/main" xmlns:w14="http://schemas.microsoft.com/office/word/2010/wordml" xmlns:w15="http://schemas.microsoft.com/office/word/2012/wordml" mc:Ignorable="w14 w15">
   <w:docDefaults>
-    <w:rPrDefault/>
-    <w:pPrDefault/>
+    <w:rPrDefault>
+      <w:rPr>
+        <w:lang w:val="ru-RU" w:eastAsia="en-US" w:bidi="he-IL"/>
+      </w:rPr>
+    </w:rPrDefault>
+    <w:pPrDefault>
+      <w:pPr>
+        <w:bidi w:val="0"/>
+        <w:jc w:val="left"/>
+      </w:pPr>
+    </w:pPrDefault>
   </w:docDefaults>
+  <w:style w:type="paragraph" w:default="1" w:styleId="Normal">
+    <w:name w:val="Normal"/>
+    <w:qFormat/>
+    <w:pPr>
+      <w:bidi w:val="0"/>
+      <w:jc w:val="left"/>
+    </w:pPr>
+    <w:rPr>
+      <w:lang w:val="ru-RU"/>
+    </w:rPr>
+  </w:style>
   <w:style w:type="paragraph" w:styleId="Title">
     <w:name w:val="Title"/>
     <w:basedOn w:val="Normal"/>

</xml_diff>